<commit_message>
Update do link do repositório
</commit_message>
<xml_diff>
--- a/artigo/artigo_parcial_AuditAI_Senado.docx
+++ b/artigo/artigo_parcial_AuditAI_Senado.docx
@@ -5837,13 +5837,27 @@
         <w:ind w:firstLine="0"/>
       </w:pPr>
       <w:r>
-        <w:t xml:space="preserve">Todo o material está disponível publicamente em </w:t>
-      </w:r>
+        <w:t>Todo o material do projeto está disponível publicamente no GitHub, no endereço:</w:t>
+      </w:r>
+    </w:p>
+    <w:p>
+      <w:pPr>
+        <w:pStyle w:val="Normal"/>
+        <w:keepLines/>
+        <w:ind w:firstLine="0"/>
+        <w:jc w:val="center"/>
+      </w:pPr>
       <w:r>
         <w:t>https://github.com/igorsa-hub/auditai-senado</w:t>
       </w:r>
-      <w:r>
-        <w:t xml:space="preserve">: o artigo (PDF e fonte LaTeX), a descrição do </w:t>
+    </w:p>
+    <w:p>
+      <w:pPr>
+        <w:pStyle w:val="Normal"/>
+        <w:ind w:firstLine="0"/>
+      </w:pPr>
+      <w:r>
+        <w:t xml:space="preserve">O repositório contém o artigo (PDF, Word e fonte LaTeX), a descrição do </w:t>
       </w:r>
       <w:r>
         <w:rPr>

</xml_diff>